<commit_message>
UST-01 sellada: VALIDADA Y CERRADA (0.22.2/0.22.3 publicadas) — el archivo del hub cuenta la verdad
</commit_message>
<xml_diff>
--- a/_integration/docs/ust/UST-2026-08-18-01-reskin-nutrilog.docx
+++ b/_integration/docs/ust/UST-2026-08-18-01-reskin-nutrilog.docx
@@ -45,7 +45,7 @@
           <w:sz w:val="21"/>
           <w:szCs w:val="21"/>
         </w:rPr>
-        <w:t xml:space="preserve">ESTADO: PENDIENTE DE VALIDACIÓN — la OTA no se lanza hasta el visto bueno fila a fila.</w:t>
+        <w:t xml:space="preserve">ESTADO: VALIDADA Y CERRADA (18-ago) — desplegada en la OTA 0.22.3, vista en producción en dispositivo y cotejada; releases 0.22.2 y 0.22.3 publicadas con fecha real en 🚢.</w:t>
       </w:r>
     </w:p>
     <w:p>
@@ -1833,6 +1833,20 @@
           <w:szCs w:val="19"/>
         </w:rPr>
         <w:t xml:space="preserve">Este documento vive en el hub: /hub/documentation/ust/UST-2026-08-18-01-reskin-nutrilog.docx (lo publica el próximo tren web). El item «Reskin completo NutriLog» del 📚 backlog lo enlaza en sus notas. Código: appdev c9a3007 · SQL backend-sql/2026-08-18-ota-0-22-3-reskin.sql · Edge analyse-meal prompt v2.</w:t>
+      </w:r>
+    </w:p>
+    <w:p>
+      <w:pPr>
+        <w:spacing w:after="120"/>
+      </w:pPr>
+      <w:r>
+        <w:rPr>
+          <w:rFonts w:ascii="Calibri" w:cs="Calibri" w:eastAsia="Calibri" w:hAnsi="Calibri"/>
+          <w:color w:val="7D6469"/>
+          <w:sz w:val="19"/>
+          <w:szCs w:val="19"/>
+        </w:rPr>
+        <w:t xml:space="preserve">Cierre (18-ago): pantallas verificadas en producción por Juanjo (capturas), releases 0.22.2/0.22.3 publicadas via 2026-08-18-cierre-0-22-2-y-0-22-3.sql. Pendientes que siguieron su propio camino: cámara custom (item 0.23) · rationale nutricional por tags (fast-follow RPC) · foto-cuenta-en-score (item «Las comidas por FOTO cuentan», UST-03).</w:t>
       </w:r>
     </w:p>
     <w:sectPr>

</xml_diff>